<commit_message>
Atualiza guia e manual com controlo de qualidade dos horarios
</commit_message>
<xml_diff>
--- a/public/docs/manual-manageop.docx
+++ b/public/docs/manual-manageop.docx
@@ -729,46 +729,150 @@
           <w:i w:val="false"/>
           <w:iCs w:val="false"/>
         </w:rPr>
-        <w:t xml:space="preserve">Gera o horário do Turno 1 com rotação justa das horas de almoço.</w:t>
-      </w:r>
-    </w:p>
-    <w:p>
-      <w:pPr>
-        <w:pStyle w:val="ListParagraph"/>
-        <w:numPr>
-          <w:ilvl w:val="0"/>
-          <w:numId w:val="1"/>
-        </w:numPr>
-        <w:spacing w:after="60"/>
-      </w:pPr>
-      <w:r>
-        <w:t xml:space="preserve">Selecione o dia a organizar.</w:t>
-      </w:r>
-    </w:p>
-    <w:p>
-      <w:pPr>
-        <w:pStyle w:val="ListParagraph"/>
-        <w:numPr>
-          <w:ilvl w:val="0"/>
-          <w:numId w:val="1"/>
-        </w:numPr>
-        <w:spacing w:after="60"/>
-      </w:pPr>
-      <w:r>
-        <w:t xml:space="preserve">Gere ou ajuste o horário dos trabalhadores.</w:t>
-      </w:r>
-    </w:p>
-    <w:p>
-      <w:pPr>
-        <w:pStyle w:val="ListParagraph"/>
-        <w:numPr>
-          <w:ilvl w:val="0"/>
-          <w:numId w:val="1"/>
-        </w:numPr>
-        <w:spacing w:after="60"/>
-      </w:pPr>
-      <w:r>
-        <w:t xml:space="preserve">Confirme a rotação das horas de almoço.</w:t>
+        <w:t xml:space="preserve">Gera o horário do Turno 1 com rotação das horas de almoço e integra o controlo de qualidade da linha Honetop hora a hora.</w:t>
+      </w:r>
+    </w:p>
+    <w:p>
+      <w:pPr>
+        <w:pStyle w:val="ListParagraph"/>
+        <w:numPr>
+          <w:ilvl w:val="0"/>
+          <w:numId w:val="1"/>
+        </w:numPr>
+        <w:spacing w:after="60"/>
+      </w:pPr>
+      <w:r>
+        <w:t xml:space="preserve">Selecione o dia a organizar e gere o horário; cada geração alterna as horas de almoço, ficando sempre diferente da anterior.</w:t>
+      </w:r>
+    </w:p>
+    <w:p>
+      <w:pPr>
+        <w:pStyle w:val="ListParagraph"/>
+        <w:numPr>
+          <w:ilvl w:val="0"/>
+          <w:numId w:val="1"/>
+        </w:numPr>
+        <w:spacing w:after="60"/>
+      </w:pPr>
+      <w:r>
+        <w:t xml:space="preserve">Na primeira hora indique a sala e a tarefa no formato "Sala / Tarefa" (ex.: Honetop / Selar); nas horas seguintes repete-se apenas a sala.</w:t>
+      </w:r>
+    </w:p>
+    <w:p>
+      <w:pPr>
+        <w:pStyle w:val="ListParagraph"/>
+        <w:numPr>
+          <w:ilvl w:val="0"/>
+          <w:numId w:val="1"/>
+        </w:numPr>
+        <w:spacing w:after="60"/>
+      </w:pPr>
+      <w:r>
+        <w:t xml:space="preserve">Limpeza fica sempre às 17:00 e Saída às 18:00, mesmo ao propagar a sala às restantes horas.</w:t>
+      </w:r>
+    </w:p>
+    <w:p>
+      <w:pPr>
+        <w:pStyle w:val="ListParagraph"/>
+        <w:numPr>
+          <w:ilvl w:val="0"/>
+          <w:numId w:val="1"/>
+        </w:numPr>
+        <w:spacing w:after="60"/>
+      </w:pPr>
+      <w:r>
+        <w:t xml:space="preserve">Pode eliminar horários já gerados através do botão Eliminar em cada cartão do histórico.</w:t>
+      </w:r>
+    </w:p>
+    <w:p>
+      <w:pPr>
+        <w:spacing w:after="120"/>
+      </w:pPr>
+      <w:r>
+        <w:rPr>
+          <w:i w:val="false"/>
+          <w:iCs w:val="false"/>
+          <w:color w:val="555555"/>
+        </w:rPr>
+        <w:t xml:space="preserve">Controlo de qualidade (linha Honetop):</w:t>
+      </w:r>
+    </w:p>
+    <w:p>
+      <w:pPr>
+        <w:pStyle w:val="ListParagraph"/>
+        <w:numPr>
+          <w:ilvl w:val="0"/>
+          <w:numId w:val="1"/>
+        </w:numPr>
+        <w:spacing w:after="60"/>
+      </w:pPr>
+      <w:r>
+        <w:t xml:space="preserve">O envelope no canto superior direito do quadro Honetop pisca a vermelho e emite um sinal sonoro quando há perguntas por responder na hora atual.</w:t>
+      </w:r>
+    </w:p>
+    <w:p>
+      <w:pPr>
+        <w:pStyle w:val="ListParagraph"/>
+        <w:numPr>
+          <w:ilvl w:val="0"/>
+          <w:numId w:val="1"/>
+        </w:numPr>
+        <w:spacing w:after="60"/>
+      </w:pPr>
+      <w:r>
+        <w:t xml:space="preserve">As perguntas de cada hora são: Zona de produção limpa e sem objetos estranhos? / Teste de arranque executado? / Selamento validado? / Lote validado? — cada uma com resposta OK ou NOK.</w:t>
+      </w:r>
+    </w:p>
+    <w:p>
+      <w:pPr>
+        <w:pStyle w:val="ListParagraph"/>
+        <w:numPr>
+          <w:ilvl w:val="0"/>
+          <w:numId w:val="1"/>
+        </w:numPr>
+        <w:spacing w:after="60"/>
+      </w:pPr>
+      <w:r>
+        <w:t xml:space="preserve">Apenas na primeira hora (09:00) há a pergunta adicional: Teste organolético com resultado ok?</w:t>
+      </w:r>
+    </w:p>
+    <w:p>
+      <w:pPr>
+        <w:pStyle w:val="ListParagraph"/>
+        <w:numPr>
+          <w:ilvl w:val="0"/>
+          <w:numId w:val="1"/>
+        </w:numPr>
+        <w:spacing w:after="60"/>
+      </w:pPr>
+      <w:r>
+        <w:t xml:space="preserve">Qualquer resposta NOK bloqueia o arranque da linha até ser corrigida.</w:t>
+      </w:r>
+    </w:p>
+    <w:p>
+      <w:pPr>
+        <w:pStyle w:val="ListParagraph"/>
+        <w:numPr>
+          <w:ilvl w:val="0"/>
+          <w:numId w:val="1"/>
+        </w:numPr>
+        <w:spacing w:after="60"/>
+      </w:pPr>
+      <w:r>
+        <w:t xml:space="preserve">O controlo de qualidade e os alarmes não são executados às 17:00 (Limpeza) nem às 18:00 (Saída).</w:t>
+      </w:r>
+    </w:p>
+    <w:p>
+      <w:pPr>
+        <w:spacing w:after="120"/>
+      </w:pPr>
+      <w:r>
+        <w:rPr>
+          <w:i w:val="false"/>
+          <w:iCs w:val="false"/>
+          <w:color w:val="555555"/>
+        </w:rPr>
+        <w:t xml:space="preserve">Nota: o sinal sonoro toca após a primeira interação com a página (política de autoplay dos navegadores).</w:t>
       </w:r>
     </w:p>
     <w:p>

</xml_diff>

<commit_message>
Adicionar botão para eliminar material no stock atual (BOM)
</commit_message>
<xml_diff>
--- a/public/docs/manual-manageop.docx
+++ b/public/docs/manual-manageop.docx
@@ -513,6 +513,19 @@
       </w:pPr>
       <w:r>
         <w:t xml:space="preserve">Verifique o stock antes de requisitar materiais na produção.</w:t>
+      </w:r>
+    </w:p>
+    <w:p>
+      <w:pPr>
+        <w:pStyle w:val="ListParagraph"/>
+        <w:numPr>
+          <w:ilvl w:val="0"/>
+          <w:numId w:val="1"/>
+        </w:numPr>
+        <w:spacing w:after="60"/>
+      </w:pPr>
+      <w:r>
+        <w:t xml:space="preserve">No quadro "Stock atual", use o botão "Eliminar" no cartão do material para o remover do stock.</w:t>
       </w:r>
     </w:p>
     <w:p>

</xml_diff>

<commit_message>
BOM: stock em linhas com pesquisa e qtd. a devolver; adiciona Gestão com Qualidade
</commit_message>
<xml_diff>
--- a/public/docs/manual-manageop.docx
+++ b/public/docs/manual-manageop.docx
@@ -525,7 +525,33 @@
         <w:spacing w:after="60"/>
       </w:pPr>
       <w:r>
-        <w:t xml:space="preserve">No quadro "Stock atual", use o botão "Eliminar" no cartão do material para o remover do stock.</w:t>
+        <w:t xml:space="preserve">No quadro "Stock atual" os materiais são apresentados em linhas; use a barra de pesquisa para encontrar qualquer artigo por nome, código ou lote.</w:t>
+      </w:r>
+    </w:p>
+    <w:p>
+      <w:pPr>
+        <w:pStyle w:val="ListParagraph"/>
+        <w:numPr>
+          <w:ilvl w:val="0"/>
+          <w:numId w:val="1"/>
+        </w:numPr>
+        <w:spacing w:after="60"/>
+      </w:pPr>
+      <w:r>
+        <w:t xml:space="preserve">Use o botão "Eliminar" na linha do material para o remover do stock.</w:t>
+      </w:r>
+    </w:p>
+    <w:p>
+      <w:pPr>
+        <w:pStyle w:val="ListParagraph"/>
+        <w:numPr>
+          <w:ilvl w:val="0"/>
+          <w:numId w:val="1"/>
+        </w:numPr>
+        <w:spacing w:after="60"/>
+      </w:pPr>
+      <w:r>
+        <w:t xml:space="preserve">No separador "Produção", ao pedir a devolução ao armazém indique no campo "Qtd. a devolver" a quantidade a devolver.</w:t>
       </w:r>
     </w:p>
     <w:p>
@@ -539,6 +565,121 @@
           <w:color w:val="555555"/>
         </w:rPr>
         <w:t xml:space="preserve">Liga a: Linhas de Produção, Honetop.</w:t>
+      </w:r>
+    </w:p>
+    <w:p>
+      <w:pPr>
+        <w:pStyle w:val="Heading2"/>
+        <w:spacing w:after="100" w:before="240"/>
+      </w:pPr>
+      <w:r>
+        <w:rPr>
+          <w:b/>
+          <w:bCs/>
+        </w:rPr>
+        <w:t xml:space="preserve">Gestão</w:t>
+      </w:r>
+    </w:p>
+    <w:p>
+      <w:pPr>
+        <w:spacing w:after="120"/>
+      </w:pPr>
+      <w:r>
+        <w:rPr>
+          <w:i w:val="false"/>
+          <w:iCs w:val="false"/>
+        </w:rPr>
+        <w:t xml:space="preserve">Área de gestão das operações, acessível pelo menu lateral. Reúne os módulos de gestão em cartões.</w:t>
+      </w:r>
+    </w:p>
+    <w:p>
+      <w:pPr>
+        <w:pStyle w:val="ListParagraph"/>
+        <w:numPr>
+          <w:ilvl w:val="0"/>
+          <w:numId w:val="1"/>
+        </w:numPr>
+        <w:spacing w:after="60"/>
+      </w:pPr>
+      <w:r>
+        <w:t xml:space="preserve">Abra o cartão "Qualidade" para consultar o controlo de qualidade da produção.</w:t>
+      </w:r>
+    </w:p>
+    <w:p>
+      <w:pPr>
+        <w:spacing w:after="120"/>
+      </w:pPr>
+      <w:r>
+        <w:rPr>
+          <w:i w:val="false"/>
+          <w:iCs w:val="false"/>
+          <w:color w:val="555555"/>
+        </w:rPr>
+        <w:t xml:space="preserve">Liga a: Qualidade, Escalas.</w:t>
+      </w:r>
+    </w:p>
+    <w:p>
+      <w:pPr>
+        <w:pStyle w:val="Heading2"/>
+        <w:spacing w:after="100" w:before="240"/>
+      </w:pPr>
+      <w:r>
+        <w:rPr>
+          <w:b/>
+          <w:bCs/>
+        </w:rPr>
+        <w:t xml:space="preserve">Gestão · Qualidade</w:t>
+      </w:r>
+    </w:p>
+    <w:p>
+      <w:pPr>
+        <w:spacing w:after="120"/>
+      </w:pPr>
+      <w:r>
+        <w:rPr>
+          <w:i w:val="false"/>
+          <w:iCs w:val="false"/>
+        </w:rPr>
+        <w:t xml:space="preserve">Resumo do controlo de qualidade da linha Honetop, respondido hora a hora no quadro de escalas.</w:t>
+      </w:r>
+    </w:p>
+    <w:p>
+      <w:pPr>
+        <w:pStyle w:val="ListParagraph"/>
+        <w:numPr>
+          <w:ilvl w:val="0"/>
+          <w:numId w:val="1"/>
+        </w:numPr>
+        <w:spacing w:after="60"/>
+      </w:pPr>
+      <w:r>
+        <w:t xml:space="preserve">As perguntas OK/NOK são respondidas no envelope de alerta do quadro de escalas.</w:t>
+      </w:r>
+    </w:p>
+    <w:p>
+      <w:pPr>
+        <w:pStyle w:val="ListParagraph"/>
+        <w:numPr>
+          <w:ilvl w:val="0"/>
+          <w:numId w:val="1"/>
+        </w:numPr>
+        <w:spacing w:after="60"/>
+      </w:pPr>
+      <w:r>
+        <w:t xml:space="preserve">Uma resposta NOK bloqueia o arranque da linha; às 09:00 há a pergunta do teste organolético.</w:t>
+      </w:r>
+    </w:p>
+    <w:p>
+      <w:pPr>
+        <w:spacing w:after="120"/>
+      </w:pPr>
+      <w:r>
+        <w:rPr>
+          <w:i w:val="false"/>
+          <w:iCs w:val="false"/>
+          <w:color w:val="555555"/>
+        </w:rPr>
+        <w:t xml:space="preserve">Liga a: Escalas, Gestão.</w:t>
       </w:r>
     </w:p>
     <w:p>

</xml_diff>

<commit_message>
Adicionar controlo de qualidade por sala com envelope, configuração e Gestão
</commit_message>
<xml_diff>
--- a/public/docs/manual-manageop.docx
+++ b/public/docs/manual-manageop.docx
@@ -474,97 +474,71 @@
           <w:b/>
           <w:bCs/>
         </w:rPr>
-        <w:t xml:space="preserve">BOM (Lista de Materiais)</w:t>
-      </w:r>
-    </w:p>
-    <w:p>
-      <w:pPr>
-        <w:spacing w:after="120"/>
-      </w:pPr>
-      <w:r>
-        <w:rPr>
-          <w:i w:val="false"/>
-          <w:iCs w:val="false"/>
-        </w:rPr>
-        <w:t xml:space="preserve">Mostra os materiais e o stock necessários para cada produto.</w:t>
-      </w:r>
-    </w:p>
-    <w:p>
-      <w:pPr>
-        <w:pStyle w:val="ListParagraph"/>
-        <w:numPr>
-          <w:ilvl w:val="0"/>
-          <w:numId w:val="1"/>
-        </w:numPr>
-        <w:spacing w:after="60"/>
-      </w:pPr>
-      <w:r>
-        <w:t xml:space="preserve">Consulte os materiais e quantidades por produto.</w:t>
-      </w:r>
-    </w:p>
-    <w:p>
-      <w:pPr>
-        <w:pStyle w:val="ListParagraph"/>
-        <w:numPr>
-          <w:ilvl w:val="0"/>
-          <w:numId w:val="1"/>
-        </w:numPr>
-        <w:spacing w:after="60"/>
-      </w:pPr>
-      <w:r>
-        <w:t xml:space="preserve">Verifique o stock antes de requisitar materiais na produção.</w:t>
-      </w:r>
-    </w:p>
-    <w:p>
-      <w:pPr>
-        <w:pStyle w:val="ListParagraph"/>
-        <w:numPr>
-          <w:ilvl w:val="0"/>
-          <w:numId w:val="1"/>
-        </w:numPr>
-        <w:spacing w:after="60"/>
-      </w:pPr>
-      <w:r>
-        <w:t xml:space="preserve">No quadro "Stock atual" os materiais são apresentados em linhas; use a barra de pesquisa para encontrar qualquer artigo por nome, código ou lote.</w:t>
-      </w:r>
-    </w:p>
-    <w:p>
-      <w:pPr>
-        <w:pStyle w:val="ListParagraph"/>
-        <w:numPr>
-          <w:ilvl w:val="0"/>
-          <w:numId w:val="1"/>
-        </w:numPr>
-        <w:spacing w:after="60"/>
-      </w:pPr>
-      <w:r>
-        <w:t xml:space="preserve">Use o botão "Eliminar" na linha do material para o remover do stock.</w:t>
-      </w:r>
-    </w:p>
-    <w:p>
-      <w:pPr>
-        <w:pStyle w:val="ListParagraph"/>
-        <w:numPr>
-          <w:ilvl w:val="0"/>
-          <w:numId w:val="1"/>
-        </w:numPr>
-        <w:spacing w:after="60"/>
-      </w:pPr>
-      <w:r>
-        <w:t xml:space="preserve">No separador "Produção", ao pedir a devolução ao armazém indique no campo "Qtd. a devolver" a quantidade a devolver.</w:t>
-      </w:r>
-    </w:p>
-    <w:p>
-      <w:pPr>
-        <w:spacing w:after="120"/>
-      </w:pPr>
-      <w:r>
-        <w:rPr>
-          <w:i w:val="false"/>
-          <w:iCs w:val="false"/>
-          <w:color w:val="555555"/>
-        </w:rPr>
-        <w:t xml:space="preserve">Liga a: Linhas de Produção, Honetop.</w:t>
+        <w:t xml:space="preserve">Produção Barritas</w:t>
+      </w:r>
+    </w:p>
+    <w:p>
+      <w:pPr>
+        <w:spacing w:after="120"/>
+      </w:pPr>
+      <w:r>
+        <w:rPr>
+          <w:i w:val="false"/>
+          <w:iCs w:val="false"/>
+        </w:rPr>
+        <w:t xml:space="preserve">Sala de produção de barritas com controlo de qualidade por envelope, tal como a Honetop.</w:t>
+      </w:r>
+    </w:p>
+    <w:p>
+      <w:pPr>
+        <w:pStyle w:val="ListParagraph"/>
+        <w:numPr>
+          <w:ilvl w:val="0"/>
+          <w:numId w:val="1"/>
+        </w:numPr>
+        <w:spacing w:after="60"/>
+      </w:pPr>
+      <w:r>
+        <w:t xml:space="preserve">O envelope no canto superior esquerdo pisca e emite um sinal sonoro a cada hora, exceto às 17:00 e 18:00.</w:t>
+      </w:r>
+    </w:p>
+    <w:p>
+      <w:pPr>
+        <w:pStyle w:val="ListParagraph"/>
+        <w:numPr>
+          <w:ilvl w:val="0"/>
+          <w:numId w:val="1"/>
+        </w:numPr>
+        <w:spacing w:after="60"/>
+      </w:pPr>
+      <w:r>
+        <w:t xml:space="preserve">Abra o envelope e responda OK / NOK às perguntas definidas pela Qualidade para a hora atual.</w:t>
+      </w:r>
+    </w:p>
+    <w:p>
+      <w:pPr>
+        <w:pStyle w:val="ListParagraph"/>
+        <w:numPr>
+          <w:ilvl w:val="0"/>
+          <w:numId w:val="1"/>
+        </w:numPr>
+        <w:spacing w:after="60"/>
+      </w:pPr>
+      <w:r>
+        <w:t xml:space="preserve">Indique o lote em produção ao responder; as respostas ficam registadas por lote e por dia em Gestão › Qualidade.</w:t>
+      </w:r>
+    </w:p>
+    <w:p>
+      <w:pPr>
+        <w:spacing w:after="120"/>
+      </w:pPr>
+      <w:r>
+        <w:rPr>
+          <w:i w:val="false"/>
+          <w:iCs w:val="false"/>
+          <w:color w:val="555555"/>
+        </w:rPr>
+        <w:t xml:space="preserve">Liga a: Qualidade, Configurações.</w:t>
       </w:r>
     </w:p>
     <w:p>
@@ -577,45 +551,97 @@
           <w:b/>
           <w:bCs/>
         </w:rPr>
-        <w:t xml:space="preserve">Gestão</w:t>
-      </w:r>
-    </w:p>
-    <w:p>
-      <w:pPr>
-        <w:spacing w:after="120"/>
-      </w:pPr>
-      <w:r>
-        <w:rPr>
-          <w:i w:val="false"/>
-          <w:iCs w:val="false"/>
-        </w:rPr>
-        <w:t xml:space="preserve">Área de gestão das operações, acessível pelo menu lateral. Reúne os módulos de gestão em cartões.</w:t>
-      </w:r>
-    </w:p>
-    <w:p>
-      <w:pPr>
-        <w:pStyle w:val="ListParagraph"/>
-        <w:numPr>
-          <w:ilvl w:val="0"/>
-          <w:numId w:val="1"/>
-        </w:numPr>
-        <w:spacing w:after="60"/>
-      </w:pPr>
-      <w:r>
-        <w:t xml:space="preserve">Abra o cartão "Qualidade" para consultar o controlo de qualidade da produção.</w:t>
-      </w:r>
-    </w:p>
-    <w:p>
-      <w:pPr>
-        <w:spacing w:after="120"/>
-      </w:pPr>
-      <w:r>
-        <w:rPr>
-          <w:i w:val="false"/>
-          <w:iCs w:val="false"/>
-          <w:color w:val="555555"/>
-        </w:rPr>
-        <w:t xml:space="preserve">Liga a: Qualidade, Escalas.</w:t>
+        <w:t xml:space="preserve">BOM (Lista de Materiais)</w:t>
+      </w:r>
+    </w:p>
+    <w:p>
+      <w:pPr>
+        <w:spacing w:after="120"/>
+      </w:pPr>
+      <w:r>
+        <w:rPr>
+          <w:i w:val="false"/>
+          <w:iCs w:val="false"/>
+        </w:rPr>
+        <w:t xml:space="preserve">Mostra os materiais e o stock necessários para cada produto.</w:t>
+      </w:r>
+    </w:p>
+    <w:p>
+      <w:pPr>
+        <w:pStyle w:val="ListParagraph"/>
+        <w:numPr>
+          <w:ilvl w:val="0"/>
+          <w:numId w:val="1"/>
+        </w:numPr>
+        <w:spacing w:after="60"/>
+      </w:pPr>
+      <w:r>
+        <w:t xml:space="preserve">Consulte os materiais e quantidades por produto.</w:t>
+      </w:r>
+    </w:p>
+    <w:p>
+      <w:pPr>
+        <w:pStyle w:val="ListParagraph"/>
+        <w:numPr>
+          <w:ilvl w:val="0"/>
+          <w:numId w:val="1"/>
+        </w:numPr>
+        <w:spacing w:after="60"/>
+      </w:pPr>
+      <w:r>
+        <w:t xml:space="preserve">Verifique o stock antes de requisitar materiais na produção.</w:t>
+      </w:r>
+    </w:p>
+    <w:p>
+      <w:pPr>
+        <w:pStyle w:val="ListParagraph"/>
+        <w:numPr>
+          <w:ilvl w:val="0"/>
+          <w:numId w:val="1"/>
+        </w:numPr>
+        <w:spacing w:after="60"/>
+      </w:pPr>
+      <w:r>
+        <w:t xml:space="preserve">No quadro "Stock atual" os materiais são apresentados em linhas; use a barra de pesquisa para encontrar qualquer artigo por nome, código ou lote.</w:t>
+      </w:r>
+    </w:p>
+    <w:p>
+      <w:pPr>
+        <w:pStyle w:val="ListParagraph"/>
+        <w:numPr>
+          <w:ilvl w:val="0"/>
+          <w:numId w:val="1"/>
+        </w:numPr>
+        <w:spacing w:after="60"/>
+      </w:pPr>
+      <w:r>
+        <w:t xml:space="preserve">Use o botão "Eliminar" na linha do material para o remover do stock.</w:t>
+      </w:r>
+    </w:p>
+    <w:p>
+      <w:pPr>
+        <w:pStyle w:val="ListParagraph"/>
+        <w:numPr>
+          <w:ilvl w:val="0"/>
+          <w:numId w:val="1"/>
+        </w:numPr>
+        <w:spacing w:after="60"/>
+      </w:pPr>
+      <w:r>
+        <w:t xml:space="preserve">No separador "Produção", ao pedir a devolução ao armazém indique no campo "Qtd. a devolver" a quantidade a devolver.</w:t>
+      </w:r>
+    </w:p>
+    <w:p>
+      <w:pPr>
+        <w:spacing w:after="120"/>
+      </w:pPr>
+      <w:r>
+        <w:rPr>
+          <w:i w:val="false"/>
+          <w:iCs w:val="false"/>
+          <w:color w:val="555555"/>
+        </w:rPr>
+        <w:t xml:space="preserve">Liga a: Linhas de Produção, Honetop.</w:t>
       </w:r>
     </w:p>
     <w:p>
@@ -628,58 +654,45 @@
           <w:b/>
           <w:bCs/>
         </w:rPr>
-        <w:t xml:space="preserve">Gestão · Qualidade</w:t>
-      </w:r>
-    </w:p>
-    <w:p>
-      <w:pPr>
-        <w:spacing w:after="120"/>
-      </w:pPr>
-      <w:r>
-        <w:rPr>
-          <w:i w:val="false"/>
-          <w:iCs w:val="false"/>
-        </w:rPr>
-        <w:t xml:space="preserve">Resumo do controlo de qualidade da linha Honetop, respondido hora a hora no quadro de escalas.</w:t>
-      </w:r>
-    </w:p>
-    <w:p>
-      <w:pPr>
-        <w:pStyle w:val="ListParagraph"/>
-        <w:numPr>
-          <w:ilvl w:val="0"/>
-          <w:numId w:val="1"/>
-        </w:numPr>
-        <w:spacing w:after="60"/>
-      </w:pPr>
-      <w:r>
-        <w:t xml:space="preserve">As perguntas OK/NOK são respondidas no envelope de alerta do quadro de escalas.</w:t>
-      </w:r>
-    </w:p>
-    <w:p>
-      <w:pPr>
-        <w:pStyle w:val="ListParagraph"/>
-        <w:numPr>
-          <w:ilvl w:val="0"/>
-          <w:numId w:val="1"/>
-        </w:numPr>
-        <w:spacing w:after="60"/>
-      </w:pPr>
-      <w:r>
-        <w:t xml:space="preserve">Uma resposta NOK bloqueia o arranque da linha; às 09:00 há a pergunta do teste organolético.</w:t>
-      </w:r>
-    </w:p>
-    <w:p>
-      <w:pPr>
-        <w:spacing w:after="120"/>
-      </w:pPr>
-      <w:r>
-        <w:rPr>
-          <w:i w:val="false"/>
-          <w:iCs w:val="false"/>
-          <w:color w:val="555555"/>
-        </w:rPr>
-        <w:t xml:space="preserve">Liga a: Escalas, Gestão.</w:t>
+        <w:t xml:space="preserve">Gestão</w:t>
+      </w:r>
+    </w:p>
+    <w:p>
+      <w:pPr>
+        <w:spacing w:after="120"/>
+      </w:pPr>
+      <w:r>
+        <w:rPr>
+          <w:i w:val="false"/>
+          <w:iCs w:val="false"/>
+        </w:rPr>
+        <w:t xml:space="preserve">Área de gestão das operações, acessível pelo menu lateral. Reúne os módulos de gestão em cartões.</w:t>
+      </w:r>
+    </w:p>
+    <w:p>
+      <w:pPr>
+        <w:pStyle w:val="ListParagraph"/>
+        <w:numPr>
+          <w:ilvl w:val="0"/>
+          <w:numId w:val="1"/>
+        </w:numPr>
+        <w:spacing w:after="60"/>
+      </w:pPr>
+      <w:r>
+        <w:t xml:space="preserve">Abra o cartão "Qualidade" para consultar o controlo de qualidade das salas de produção.</w:t>
+      </w:r>
+    </w:p>
+    <w:p>
+      <w:pPr>
+        <w:spacing w:after="120"/>
+      </w:pPr>
+      <w:r>
+        <w:rPr>
+          <w:i w:val="false"/>
+          <w:iCs w:val="false"/>
+          <w:color w:val="555555"/>
+        </w:rPr>
+        <w:t xml:space="preserve">Liga a: Qualidade, Configurações.</w:t>
       </w:r>
     </w:p>
     <w:p>
@@ -692,32 +705,71 @@
           <w:b/>
           <w:bCs/>
         </w:rPr>
-        <w:t xml:space="preserve">Planeamento</w:t>
-      </w:r>
-    </w:p>
-    <w:p>
-      <w:pPr>
-        <w:spacing w:after="120"/>
-      </w:pPr>
-      <w:r>
-        <w:rPr>
-          <w:i w:val="false"/>
-          <w:iCs w:val="false"/>
-        </w:rPr>
-        <w:t xml:space="preserve">Planeamento geral da produção, que alimenta o plano semanal e o coordenador.</w:t>
-      </w:r>
-    </w:p>
-    <w:p>
-      <w:pPr>
-        <w:spacing w:after="120"/>
-      </w:pPr>
-      <w:r>
-        <w:rPr>
-          <w:i w:val="false"/>
-          <w:iCs w:val="false"/>
-          <w:color w:val="555555"/>
-        </w:rPr>
-        <w:t xml:space="preserve">Liga a: Plano Semanal, Coordenador.</w:t>
+        <w:t xml:space="preserve">Gestão · Qualidade</w:t>
+      </w:r>
+    </w:p>
+    <w:p>
+      <w:pPr>
+        <w:spacing w:after="120"/>
+      </w:pPr>
+      <w:r>
+        <w:rPr>
+          <w:i w:val="false"/>
+          <w:iCs w:val="false"/>
+        </w:rPr>
+        <w:t xml:space="preserve">Acompanhamento das respostas do controlo de qualidade das salas de produção, agrupadas por sala, lote e dia.</w:t>
+      </w:r>
+    </w:p>
+    <w:p>
+      <w:pPr>
+        <w:pStyle w:val="ListParagraph"/>
+        <w:numPr>
+          <w:ilvl w:val="0"/>
+          <w:numId w:val="1"/>
+        </w:numPr>
+        <w:spacing w:after="60"/>
+      </w:pPr>
+      <w:r>
+        <w:t xml:space="preserve">Cada cartão representa uma sala e um lote num dia, mostrando as respostas dadas hora a hora.</w:t>
+      </w:r>
+    </w:p>
+    <w:p>
+      <w:pPr>
+        <w:pStyle w:val="ListParagraph"/>
+        <w:numPr>
+          <w:ilvl w:val="0"/>
+          <w:numId w:val="1"/>
+        </w:numPr>
+        <w:spacing w:after="60"/>
+      </w:pPr>
+      <w:r>
+        <w:t xml:space="preserve">O selo indica se o lote está "Conforme" ou tem "Não conformidade" (alguma resposta NOK).</w:t>
+      </w:r>
+    </w:p>
+    <w:p>
+      <w:pPr>
+        <w:pStyle w:val="ListParagraph"/>
+        <w:numPr>
+          <w:ilvl w:val="0"/>
+          <w:numId w:val="1"/>
+        </w:numPr>
+        <w:spacing w:after="60"/>
+      </w:pPr>
+      <w:r>
+        <w:t xml:space="preserve">As perguntas são configuradas em Configurações › Qualidade e respondidas nas salas através do envelope.</w:t>
+      </w:r>
+    </w:p>
+    <w:p>
+      <w:pPr>
+        <w:spacing w:after="120"/>
+      </w:pPr>
+      <w:r>
+        <w:rPr>
+          <w:i w:val="false"/>
+          <w:iCs w:val="false"/>
+          <w:color w:val="555555"/>
+        </w:rPr>
+        <w:t xml:space="preserve">Liga a: Configurações, Honetop, Barritas.</w:t>
       </w:r>
     </w:p>
     <w:p>
@@ -730,71 +782,32 @@
           <w:b/>
           <w:bCs/>
         </w:rPr>
-        <w:t xml:space="preserve">Plano Semanal</w:t>
-      </w:r>
-    </w:p>
-    <w:p>
-      <w:pPr>
-        <w:spacing w:after="120"/>
-      </w:pPr>
-      <w:r>
-        <w:rPr>
-          <w:i w:val="false"/>
-          <w:iCs w:val="false"/>
-        </w:rPr>
-        <w:t xml:space="preserve">Define o plano de produção da semana, por linha e por turno.</w:t>
-      </w:r>
-    </w:p>
-    <w:p>
-      <w:pPr>
-        <w:pStyle w:val="ListParagraph"/>
-        <w:numPr>
-          <w:ilvl w:val="0"/>
-          <w:numId w:val="1"/>
-        </w:numPr>
-        <w:spacing w:after="60"/>
-      </w:pPr>
-      <w:r>
-        <w:t xml:space="preserve">Selecione a semana a planear.</w:t>
-      </w:r>
-    </w:p>
-    <w:p>
-      <w:pPr>
-        <w:pStyle w:val="ListParagraph"/>
-        <w:numPr>
-          <w:ilvl w:val="0"/>
-          <w:numId w:val="1"/>
-        </w:numPr>
-        <w:spacing w:after="60"/>
-      </w:pPr>
-      <w:r>
-        <w:t xml:space="preserve">Atribua produtos e quantidades a cada linha e turno.</w:t>
-      </w:r>
-    </w:p>
-    <w:p>
-      <w:pPr>
-        <w:pStyle w:val="ListParagraph"/>
-        <w:numPr>
-          <w:ilvl w:val="0"/>
-          <w:numId w:val="1"/>
-        </w:numPr>
-        <w:spacing w:after="60"/>
-      </w:pPr>
-      <w:r>
-        <w:t xml:space="preserve">Guarde para que o coordenador e as linhas executem o plano.</w:t>
-      </w:r>
-    </w:p>
-    <w:p>
-      <w:pPr>
-        <w:spacing w:after="120"/>
-      </w:pPr>
-      <w:r>
-        <w:rPr>
-          <w:i w:val="false"/>
-          <w:iCs w:val="false"/>
-          <w:color w:val="555555"/>
-        </w:rPr>
-        <w:t xml:space="preserve">Liga a: Coordenador, Linhas de Produção, Planeamento.</w:t>
+        <w:t xml:space="preserve">Planeamento</w:t>
+      </w:r>
+    </w:p>
+    <w:p>
+      <w:pPr>
+        <w:spacing w:after="120"/>
+      </w:pPr>
+      <w:r>
+        <w:rPr>
+          <w:i w:val="false"/>
+          <w:iCs w:val="false"/>
+        </w:rPr>
+        <w:t xml:space="preserve">Planeamento geral da produção, que alimenta o plano semanal e o coordenador.</w:t>
+      </w:r>
+    </w:p>
+    <w:p>
+      <w:pPr>
+        <w:spacing w:after="120"/>
+      </w:pPr>
+      <w:r>
+        <w:rPr>
+          <w:i w:val="false"/>
+          <w:iCs w:val="false"/>
+          <w:color w:val="555555"/>
+        </w:rPr>
+        <w:t xml:space="preserve">Liga a: Plano Semanal, Coordenador.</w:t>
       </w:r>
     </w:p>
     <w:p>
@@ -807,58 +820,71 @@
           <w:b/>
           <w:bCs/>
         </w:rPr>
-        <w:t xml:space="preserve">Linhas de Produção</w:t>
-      </w:r>
-    </w:p>
-    <w:p>
-      <w:pPr>
-        <w:spacing w:after="120"/>
-      </w:pPr>
-      <w:r>
-        <w:rPr>
-          <w:i w:val="false"/>
-          <w:iCs w:val="false"/>
-        </w:rPr>
-        <w:t xml:space="preserve">Gere as linhas, os produtos e as receitas/requisitos que alimentam toda a produção.</w:t>
-      </w:r>
-    </w:p>
-    <w:p>
-      <w:pPr>
-        <w:pStyle w:val="ListParagraph"/>
-        <w:numPr>
-          <w:ilvl w:val="0"/>
-          <w:numId w:val="1"/>
-        </w:numPr>
-        <w:spacing w:after="60"/>
-      </w:pPr>
-      <w:r>
-        <w:t xml:space="preserve">Crie ou edite as linhas de produção.</w:t>
-      </w:r>
-    </w:p>
-    <w:p>
-      <w:pPr>
-        <w:pStyle w:val="ListParagraph"/>
-        <w:numPr>
-          <w:ilvl w:val="0"/>
-          <w:numId w:val="1"/>
-        </w:numPr>
-        <w:spacing w:after="60"/>
-      </w:pPr>
-      <w:r>
-        <w:t xml:space="preserve">Associe produtos e as respetivas receitas de materiais.</w:t>
-      </w:r>
-    </w:p>
-    <w:p>
-      <w:pPr>
-        <w:spacing w:after="120"/>
-      </w:pPr>
-      <w:r>
-        <w:rPr>
-          <w:i w:val="false"/>
-          <w:iCs w:val="false"/>
-          <w:color w:val="555555"/>
-        </w:rPr>
-        <w:t xml:space="preserve">Liga a: BOM, Honetop, Plano Semanal.</w:t>
+        <w:t xml:space="preserve">Plano Semanal</w:t>
+      </w:r>
+    </w:p>
+    <w:p>
+      <w:pPr>
+        <w:spacing w:after="120"/>
+      </w:pPr>
+      <w:r>
+        <w:rPr>
+          <w:i w:val="false"/>
+          <w:iCs w:val="false"/>
+        </w:rPr>
+        <w:t xml:space="preserve">Define o plano de produção da semana, por linha e por turno.</w:t>
+      </w:r>
+    </w:p>
+    <w:p>
+      <w:pPr>
+        <w:pStyle w:val="ListParagraph"/>
+        <w:numPr>
+          <w:ilvl w:val="0"/>
+          <w:numId w:val="1"/>
+        </w:numPr>
+        <w:spacing w:after="60"/>
+      </w:pPr>
+      <w:r>
+        <w:t xml:space="preserve">Selecione a semana a planear.</w:t>
+      </w:r>
+    </w:p>
+    <w:p>
+      <w:pPr>
+        <w:pStyle w:val="ListParagraph"/>
+        <w:numPr>
+          <w:ilvl w:val="0"/>
+          <w:numId w:val="1"/>
+        </w:numPr>
+        <w:spacing w:after="60"/>
+      </w:pPr>
+      <w:r>
+        <w:t xml:space="preserve">Atribua produtos e quantidades a cada linha e turno.</w:t>
+      </w:r>
+    </w:p>
+    <w:p>
+      <w:pPr>
+        <w:pStyle w:val="ListParagraph"/>
+        <w:numPr>
+          <w:ilvl w:val="0"/>
+          <w:numId w:val="1"/>
+        </w:numPr>
+        <w:spacing w:after="60"/>
+      </w:pPr>
+      <w:r>
+        <w:t xml:space="preserve">Guarde para que o coordenador e as linhas executem o plano.</w:t>
+      </w:r>
+    </w:p>
+    <w:p>
+      <w:pPr>
+        <w:spacing w:after="120"/>
+      </w:pPr>
+      <w:r>
+        <w:rPr>
+          <w:i w:val="false"/>
+          <w:iCs w:val="false"/>
+          <w:color w:val="555555"/>
+        </w:rPr>
+        <w:t xml:space="preserve">Liga a: Coordenador, Linhas de Produção, Planeamento.</w:t>
       </w:r>
     </w:p>
     <w:p>
@@ -871,175 +897,58 @@
           <w:b/>
           <w:bCs/>
         </w:rPr>
-        <w:t xml:space="preserve">Horários</w:t>
-      </w:r>
-    </w:p>
-    <w:p>
-      <w:pPr>
-        <w:spacing w:after="120"/>
-      </w:pPr>
-      <w:r>
-        <w:rPr>
-          <w:i w:val="false"/>
-          <w:iCs w:val="false"/>
-        </w:rPr>
-        <w:t xml:space="preserve">Gera o horário do Turno 1 com rotação das horas de almoço e integra o controlo de qualidade da linha Honetop hora a hora.</w:t>
-      </w:r>
-    </w:p>
-    <w:p>
-      <w:pPr>
-        <w:pStyle w:val="ListParagraph"/>
-        <w:numPr>
-          <w:ilvl w:val="0"/>
-          <w:numId w:val="1"/>
-        </w:numPr>
-        <w:spacing w:after="60"/>
-      </w:pPr>
-      <w:r>
-        <w:t xml:space="preserve">Selecione o dia a organizar e gere o horário; cada geração alterna as horas de almoço, ficando sempre diferente da anterior.</w:t>
-      </w:r>
-    </w:p>
-    <w:p>
-      <w:pPr>
-        <w:pStyle w:val="ListParagraph"/>
-        <w:numPr>
-          <w:ilvl w:val="0"/>
-          <w:numId w:val="1"/>
-        </w:numPr>
-        <w:spacing w:after="60"/>
-      </w:pPr>
-      <w:r>
-        <w:t xml:space="preserve">Na primeira hora indique a sala e a tarefa no formato "Sala / Tarefa" (ex.: Honetop / Selar); nas horas seguintes repete-se apenas a sala.</w:t>
-      </w:r>
-    </w:p>
-    <w:p>
-      <w:pPr>
-        <w:pStyle w:val="ListParagraph"/>
-        <w:numPr>
-          <w:ilvl w:val="0"/>
-          <w:numId w:val="1"/>
-        </w:numPr>
-        <w:spacing w:after="60"/>
-      </w:pPr>
-      <w:r>
-        <w:t xml:space="preserve">Limpeza fica sempre às 17:00 e Saída às 18:00, mesmo ao propagar a sala às restantes horas.</w:t>
-      </w:r>
-    </w:p>
-    <w:p>
-      <w:pPr>
-        <w:pStyle w:val="ListParagraph"/>
-        <w:numPr>
-          <w:ilvl w:val="0"/>
-          <w:numId w:val="1"/>
-        </w:numPr>
-        <w:spacing w:after="60"/>
-      </w:pPr>
-      <w:r>
-        <w:t xml:space="preserve">Pode eliminar horários já gerados através do botão Eliminar em cada cartão do histórico.</w:t>
-      </w:r>
-    </w:p>
-    <w:p>
-      <w:pPr>
-        <w:spacing w:after="120"/>
-      </w:pPr>
-      <w:r>
-        <w:rPr>
-          <w:i w:val="false"/>
-          <w:iCs w:val="false"/>
-          <w:color w:val="555555"/>
-        </w:rPr>
-        <w:t xml:space="preserve">Controlo de qualidade (linha Honetop):</w:t>
-      </w:r>
-    </w:p>
-    <w:p>
-      <w:pPr>
-        <w:pStyle w:val="ListParagraph"/>
-        <w:numPr>
-          <w:ilvl w:val="0"/>
-          <w:numId w:val="1"/>
-        </w:numPr>
-        <w:spacing w:after="60"/>
-      </w:pPr>
-      <w:r>
-        <w:t xml:space="preserve">O envelope no canto superior direito do quadro Honetop pisca a vermelho e emite um sinal sonoro quando há perguntas por responder na hora atual.</w:t>
-      </w:r>
-    </w:p>
-    <w:p>
-      <w:pPr>
-        <w:pStyle w:val="ListParagraph"/>
-        <w:numPr>
-          <w:ilvl w:val="0"/>
-          <w:numId w:val="1"/>
-        </w:numPr>
-        <w:spacing w:after="60"/>
-      </w:pPr>
-      <w:r>
-        <w:t xml:space="preserve">As perguntas de cada hora são: Zona de produção limpa e sem objetos estranhos? / Teste de arranque executado? / Selamento validado? / Lote validado? — cada uma com resposta OK ou NOK.</w:t>
-      </w:r>
-    </w:p>
-    <w:p>
-      <w:pPr>
-        <w:pStyle w:val="ListParagraph"/>
-        <w:numPr>
-          <w:ilvl w:val="0"/>
-          <w:numId w:val="1"/>
-        </w:numPr>
-        <w:spacing w:after="60"/>
-      </w:pPr>
-      <w:r>
-        <w:t xml:space="preserve">Apenas na primeira hora (09:00) há a pergunta adicional: Teste organolético com resultado ok?</w:t>
-      </w:r>
-    </w:p>
-    <w:p>
-      <w:pPr>
-        <w:pStyle w:val="ListParagraph"/>
-        <w:numPr>
-          <w:ilvl w:val="0"/>
-          <w:numId w:val="1"/>
-        </w:numPr>
-        <w:spacing w:after="60"/>
-      </w:pPr>
-      <w:r>
-        <w:t xml:space="preserve">Qualquer resposta NOK bloqueia o arranque da linha até ser corrigida.</w:t>
-      </w:r>
-    </w:p>
-    <w:p>
-      <w:pPr>
-        <w:pStyle w:val="ListParagraph"/>
-        <w:numPr>
-          <w:ilvl w:val="0"/>
-          <w:numId w:val="1"/>
-        </w:numPr>
-        <w:spacing w:after="60"/>
-      </w:pPr>
-      <w:r>
-        <w:t xml:space="preserve">O controlo de qualidade e os alarmes não são executados às 17:00 (Limpeza) nem às 18:00 (Saída).</w:t>
-      </w:r>
-    </w:p>
-    <w:p>
-      <w:pPr>
-        <w:spacing w:after="120"/>
-      </w:pPr>
-      <w:r>
-        <w:rPr>
-          <w:i w:val="false"/>
-          <w:iCs w:val="false"/>
-          <w:color w:val="555555"/>
-        </w:rPr>
-        <w:t xml:space="preserve">Nota: o sinal sonoro toca após a primeira interação com a página (política de autoplay dos navegadores).</w:t>
-      </w:r>
-    </w:p>
-    <w:p>
-      <w:pPr>
-        <w:spacing w:after="120"/>
-      </w:pPr>
-      <w:r>
-        <w:rPr>
-          <w:i w:val="false"/>
-          <w:iCs w:val="false"/>
-          <w:color w:val="555555"/>
-        </w:rPr>
-        <w:t xml:space="preserve">Liga a: Coordenador, RH, Trabalhadores.</w:t>
+        <w:t xml:space="preserve">Linhas de Produção</w:t>
+      </w:r>
+    </w:p>
+    <w:p>
+      <w:pPr>
+        <w:spacing w:after="120"/>
+      </w:pPr>
+      <w:r>
+        <w:rPr>
+          <w:i w:val="false"/>
+          <w:iCs w:val="false"/>
+        </w:rPr>
+        <w:t xml:space="preserve">Gere as linhas, os produtos e as receitas/requisitos que alimentam toda a produção.</w:t>
+      </w:r>
+    </w:p>
+    <w:p>
+      <w:pPr>
+        <w:pStyle w:val="ListParagraph"/>
+        <w:numPr>
+          <w:ilvl w:val="0"/>
+          <w:numId w:val="1"/>
+        </w:numPr>
+        <w:spacing w:after="60"/>
+      </w:pPr>
+      <w:r>
+        <w:t xml:space="preserve">Crie ou edite as linhas de produção.</w:t>
+      </w:r>
+    </w:p>
+    <w:p>
+      <w:pPr>
+        <w:pStyle w:val="ListParagraph"/>
+        <w:numPr>
+          <w:ilvl w:val="0"/>
+          <w:numId w:val="1"/>
+        </w:numPr>
+        <w:spacing w:after="60"/>
+      </w:pPr>
+      <w:r>
+        <w:t xml:space="preserve">Associe produtos e as respetivas receitas de materiais.</w:t>
+      </w:r>
+    </w:p>
+    <w:p>
+      <w:pPr>
+        <w:spacing w:after="120"/>
+      </w:pPr>
+      <w:r>
+        <w:rPr>
+          <w:i w:val="false"/>
+          <w:iCs w:val="false"/>
+          <w:color w:val="555555"/>
+        </w:rPr>
+        <w:t xml:space="preserve">Liga a: BOM, Honetop, Plano Semanal.</w:t>
       </w:r>
     </w:p>
     <w:p>
@@ -1052,58 +961,97 @@
           <w:b/>
           <w:bCs/>
         </w:rPr>
-        <w:t xml:space="preserve">Recursos Humanos</w:t>
-      </w:r>
-    </w:p>
-    <w:p>
-      <w:pPr>
-        <w:spacing w:after="120"/>
-      </w:pPr>
-      <w:r>
-        <w:rPr>
-          <w:i w:val="false"/>
-          <w:iCs w:val="false"/>
-        </w:rPr>
-        <w:t xml:space="preserve">Gestão de férias e ausências dos trabalhadores.</w:t>
-      </w:r>
-    </w:p>
-    <w:p>
-      <w:pPr>
-        <w:pStyle w:val="ListParagraph"/>
-        <w:numPr>
-          <w:ilvl w:val="0"/>
-          <w:numId w:val="1"/>
-        </w:numPr>
-        <w:spacing w:after="60"/>
-      </w:pPr>
-      <w:r>
-        <w:t xml:space="preserve">Registe férias e ausências de cada trabalhador.</w:t>
-      </w:r>
-    </w:p>
-    <w:p>
-      <w:pPr>
-        <w:pStyle w:val="ListParagraph"/>
-        <w:numPr>
-          <w:ilvl w:val="0"/>
-          <w:numId w:val="1"/>
-        </w:numPr>
-        <w:spacing w:after="60"/>
-      </w:pPr>
-      <w:r>
-        <w:t xml:space="preserve">Os registos refletem-se nas escalas e no dashboard.</w:t>
-      </w:r>
-    </w:p>
-    <w:p>
-      <w:pPr>
-        <w:spacing w:after="120"/>
-      </w:pPr>
-      <w:r>
-        <w:rPr>
-          <w:i w:val="false"/>
-          <w:iCs w:val="false"/>
-          <w:color w:val="555555"/>
-        </w:rPr>
-        <w:t xml:space="preserve">Liga a: Escalas, Trabalhadores, Dashboard.</w:t>
+        <w:t xml:space="preserve">Horários</w:t>
+      </w:r>
+    </w:p>
+    <w:p>
+      <w:pPr>
+        <w:spacing w:after="120"/>
+      </w:pPr>
+      <w:r>
+        <w:rPr>
+          <w:i w:val="false"/>
+          <w:iCs w:val="false"/>
+        </w:rPr>
+        <w:t xml:space="preserve">Gera o horário do Turno 1 com rotação das horas de almoço, sempre diferente da geração anterior.</w:t>
+      </w:r>
+    </w:p>
+    <w:p>
+      <w:pPr>
+        <w:pStyle w:val="ListParagraph"/>
+        <w:numPr>
+          <w:ilvl w:val="0"/>
+          <w:numId w:val="1"/>
+        </w:numPr>
+        <w:spacing w:after="60"/>
+      </w:pPr>
+      <w:r>
+        <w:t xml:space="preserve">Selecione o dia a organizar e gere o horário; cada geração alterna as horas de almoço, ficando sempre diferente da anterior.</w:t>
+      </w:r>
+    </w:p>
+    <w:p>
+      <w:pPr>
+        <w:pStyle w:val="ListParagraph"/>
+        <w:numPr>
+          <w:ilvl w:val="0"/>
+          <w:numId w:val="1"/>
+        </w:numPr>
+        <w:spacing w:after="60"/>
+      </w:pPr>
+      <w:r>
+        <w:t xml:space="preserve">Na primeira hora indique a sala e a tarefa no formato "Sala / Tarefa" (ex.: Honetop / Selar); nas horas seguintes repete-se apenas a sala.</w:t>
+      </w:r>
+    </w:p>
+    <w:p>
+      <w:pPr>
+        <w:pStyle w:val="ListParagraph"/>
+        <w:numPr>
+          <w:ilvl w:val="0"/>
+          <w:numId w:val="1"/>
+        </w:numPr>
+        <w:spacing w:after="60"/>
+      </w:pPr>
+      <w:r>
+        <w:t xml:space="preserve">Limpeza fica sempre às 17:00 e Saída às 18:00, mesmo ao propagar a sala às restantes horas.</w:t>
+      </w:r>
+    </w:p>
+    <w:p>
+      <w:pPr>
+        <w:pStyle w:val="ListParagraph"/>
+        <w:numPr>
+          <w:ilvl w:val="0"/>
+          <w:numId w:val="1"/>
+        </w:numPr>
+        <w:spacing w:after="60"/>
+      </w:pPr>
+      <w:r>
+        <w:t xml:space="preserve">Pode eliminar horários já gerados através do botão Eliminar em cada cartão do histórico.</w:t>
+      </w:r>
+    </w:p>
+    <w:p>
+      <w:pPr>
+        <w:spacing w:after="120"/>
+      </w:pPr>
+      <w:r>
+        <w:rPr>
+          <w:i w:val="false"/>
+          <w:iCs w:val="false"/>
+          <w:color w:val="555555"/>
+        </w:rPr>
+        <w:t xml:space="preserve">Nota: o controlo de qualidade deixou de estar nas escalas — passou para as salas de produção (envelope) e para Gestão › Qualidade.</w:t>
+      </w:r>
+    </w:p>
+    <w:p>
+      <w:pPr>
+        <w:spacing w:after="120"/>
+      </w:pPr>
+      <w:r>
+        <w:rPr>
+          <w:i w:val="false"/>
+          <w:iCs w:val="false"/>
+          <w:color w:val="555555"/>
+        </w:rPr>
+        <w:t xml:space="preserve">Liga a: Coordenador, RH, Trabalhadores.</w:t>
       </w:r>
     </w:p>
     <w:p>
@@ -1116,58 +1064,58 @@
           <w:b/>
           <w:bCs/>
         </w:rPr>
-        <w:t xml:space="preserve">Quadro do Coordenador</w:t>
-      </w:r>
-    </w:p>
-    <w:p>
-      <w:pPr>
-        <w:spacing w:after="120"/>
-      </w:pPr>
-      <w:r>
-        <w:rPr>
-          <w:i w:val="false"/>
-          <w:iCs w:val="false"/>
-        </w:rPr>
-        <w:t xml:space="preserve">Painel diário para gerir as linhas e os trabalhadores no terreno.</w:t>
-      </w:r>
-    </w:p>
-    <w:p>
-      <w:pPr>
-        <w:pStyle w:val="ListParagraph"/>
-        <w:numPr>
-          <w:ilvl w:val="0"/>
-          <w:numId w:val="1"/>
-        </w:numPr>
-        <w:spacing w:after="60"/>
-      </w:pPr>
-      <w:r>
-        <w:t xml:space="preserve">Veja as linhas planeadas para o dia e os trabalhadores atribuídos.</w:t>
-      </w:r>
-    </w:p>
-    <w:p>
-      <w:pPr>
-        <w:pStyle w:val="ListParagraph"/>
-        <w:numPr>
-          <w:ilvl w:val="0"/>
-          <w:numId w:val="1"/>
-        </w:numPr>
-        <w:spacing w:after="60"/>
-      </w:pPr>
-      <w:r>
-        <w:t xml:space="preserve">Acompanhe o progresso de cada linha e ajuste conforme necessário.</w:t>
-      </w:r>
-    </w:p>
-    <w:p>
-      <w:pPr>
-        <w:spacing w:after="120"/>
-      </w:pPr>
-      <w:r>
-        <w:rPr>
-          <w:i w:val="false"/>
-          <w:iCs w:val="false"/>
-          <w:color w:val="555555"/>
-        </w:rPr>
-        <w:t xml:space="preserve">Liga a: Plano Semanal, Escalas, Linhas de Produção.</w:t>
+        <w:t xml:space="preserve">Recursos Humanos</w:t>
+      </w:r>
+    </w:p>
+    <w:p>
+      <w:pPr>
+        <w:spacing w:after="120"/>
+      </w:pPr>
+      <w:r>
+        <w:rPr>
+          <w:i w:val="false"/>
+          <w:iCs w:val="false"/>
+        </w:rPr>
+        <w:t xml:space="preserve">Gestão de férias e ausências dos trabalhadores.</w:t>
+      </w:r>
+    </w:p>
+    <w:p>
+      <w:pPr>
+        <w:pStyle w:val="ListParagraph"/>
+        <w:numPr>
+          <w:ilvl w:val="0"/>
+          <w:numId w:val="1"/>
+        </w:numPr>
+        <w:spacing w:after="60"/>
+      </w:pPr>
+      <w:r>
+        <w:t xml:space="preserve">Registe férias e ausências de cada trabalhador.</w:t>
+      </w:r>
+    </w:p>
+    <w:p>
+      <w:pPr>
+        <w:pStyle w:val="ListParagraph"/>
+        <w:numPr>
+          <w:ilvl w:val="0"/>
+          <w:numId w:val="1"/>
+        </w:numPr>
+        <w:spacing w:after="60"/>
+      </w:pPr>
+      <w:r>
+        <w:t xml:space="preserve">Os registos refletem-se nas escalas e no dashboard.</w:t>
+      </w:r>
+    </w:p>
+    <w:p>
+      <w:pPr>
+        <w:spacing w:after="120"/>
+      </w:pPr>
+      <w:r>
+        <w:rPr>
+          <w:i w:val="false"/>
+          <w:iCs w:val="false"/>
+          <w:color w:val="555555"/>
+        </w:rPr>
+        <w:t xml:space="preserve">Liga a: Escalas, Trabalhadores, Dashboard.</w:t>
       </w:r>
     </w:p>
     <w:p>
@@ -1180,45 +1128,58 @@
           <w:b/>
           <w:bCs/>
         </w:rPr>
-        <w:t xml:space="preserve">Gestão de Trabalhadores</w:t>
-      </w:r>
-    </w:p>
-    <w:p>
-      <w:pPr>
-        <w:spacing w:after="120"/>
-      </w:pPr>
-      <w:r>
-        <w:rPr>
-          <w:i w:val="false"/>
-          <w:iCs w:val="false"/>
-        </w:rPr>
-        <w:t xml:space="preserve">Cadastro de trabalhadores e das respetivas especialidades.</w:t>
-      </w:r>
-    </w:p>
-    <w:p>
-      <w:pPr>
-        <w:pStyle w:val="ListParagraph"/>
-        <w:numPr>
-          <w:ilvl w:val="0"/>
-          <w:numId w:val="1"/>
-        </w:numPr>
-        <w:spacing w:after="60"/>
-      </w:pPr>
-      <w:r>
-        <w:t xml:space="preserve">Adicione ou edite os trabalhadores e defina especialidades.</w:t>
-      </w:r>
-    </w:p>
-    <w:p>
-      <w:pPr>
-        <w:spacing w:after="120"/>
-      </w:pPr>
-      <w:r>
-        <w:rPr>
-          <w:i w:val="false"/>
-          <w:iCs w:val="false"/>
-          <w:color w:val="555555"/>
-        </w:rPr>
-        <w:t xml:space="preserve">Liga a: Escalas, RH, Coordenador.</w:t>
+        <w:t xml:space="preserve">Quadro do Coordenador</w:t>
+      </w:r>
+    </w:p>
+    <w:p>
+      <w:pPr>
+        <w:spacing w:after="120"/>
+      </w:pPr>
+      <w:r>
+        <w:rPr>
+          <w:i w:val="false"/>
+          <w:iCs w:val="false"/>
+        </w:rPr>
+        <w:t xml:space="preserve">Painel diário para gerir as linhas e os trabalhadores no terreno.</w:t>
+      </w:r>
+    </w:p>
+    <w:p>
+      <w:pPr>
+        <w:pStyle w:val="ListParagraph"/>
+        <w:numPr>
+          <w:ilvl w:val="0"/>
+          <w:numId w:val="1"/>
+        </w:numPr>
+        <w:spacing w:after="60"/>
+      </w:pPr>
+      <w:r>
+        <w:t xml:space="preserve">Veja as linhas planeadas para o dia e os trabalhadores atribuídos.</w:t>
+      </w:r>
+    </w:p>
+    <w:p>
+      <w:pPr>
+        <w:pStyle w:val="ListParagraph"/>
+        <w:numPr>
+          <w:ilvl w:val="0"/>
+          <w:numId w:val="1"/>
+        </w:numPr>
+        <w:spacing w:after="60"/>
+      </w:pPr>
+      <w:r>
+        <w:t xml:space="preserve">Acompanhe o progresso de cada linha e ajuste conforme necessário.</w:t>
+      </w:r>
+    </w:p>
+    <w:p>
+      <w:pPr>
+        <w:spacing w:after="120"/>
+      </w:pPr>
+      <w:r>
+        <w:rPr>
+          <w:i w:val="false"/>
+          <w:iCs w:val="false"/>
+          <w:color w:val="555555"/>
+        </w:rPr>
+        <w:t xml:space="preserve">Liga a: Plano Semanal, Escalas, Linhas de Produção.</w:t>
       </w:r>
     </w:p>
     <w:p>
@@ -1231,32 +1192,45 @@
           <w:b/>
           <w:bCs/>
         </w:rPr>
-        <w:t xml:space="preserve">Tarefas</w:t>
-      </w:r>
-    </w:p>
-    <w:p>
-      <w:pPr>
-        <w:spacing w:after="120"/>
-      </w:pPr>
-      <w:r>
-        <w:rPr>
-          <w:i w:val="false"/>
-          <w:iCs w:val="false"/>
-        </w:rPr>
-        <w:t xml:space="preserve">Escala mensal de tarefas da equipa.</w:t>
-      </w:r>
-    </w:p>
-    <w:p>
-      <w:pPr>
-        <w:spacing w:after="120"/>
-      </w:pPr>
-      <w:r>
-        <w:rPr>
-          <w:i w:val="false"/>
-          <w:iCs w:val="false"/>
-          <w:color w:val="555555"/>
-        </w:rPr>
-        <w:t xml:space="preserve">Liga a: Escalas, Coordenador.</w:t>
+        <w:t xml:space="preserve">Gestão de Trabalhadores</w:t>
+      </w:r>
+    </w:p>
+    <w:p>
+      <w:pPr>
+        <w:spacing w:after="120"/>
+      </w:pPr>
+      <w:r>
+        <w:rPr>
+          <w:i w:val="false"/>
+          <w:iCs w:val="false"/>
+        </w:rPr>
+        <w:t xml:space="preserve">Cadastro de trabalhadores e das respetivas especialidades.</w:t>
+      </w:r>
+    </w:p>
+    <w:p>
+      <w:pPr>
+        <w:pStyle w:val="ListParagraph"/>
+        <w:numPr>
+          <w:ilvl w:val="0"/>
+          <w:numId w:val="1"/>
+        </w:numPr>
+        <w:spacing w:after="60"/>
+      </w:pPr>
+      <w:r>
+        <w:t xml:space="preserve">Adicione ou edite os trabalhadores e defina especialidades.</w:t>
+      </w:r>
+    </w:p>
+    <w:p>
+      <w:pPr>
+        <w:spacing w:after="120"/>
+      </w:pPr>
+      <w:r>
+        <w:rPr>
+          <w:i w:val="false"/>
+          <w:iCs w:val="false"/>
+          <w:color w:val="555555"/>
+        </w:rPr>
+        <w:t xml:space="preserve">Liga a: Escalas, RH, Coordenador.</w:t>
       </w:r>
     </w:p>
     <w:p>
@@ -1269,32 +1243,32 @@
           <w:b/>
           <w:bCs/>
         </w:rPr>
-        <w:t xml:space="preserve">Produtos Acabados</w:t>
-      </w:r>
-    </w:p>
-    <w:p>
-      <w:pPr>
-        <w:spacing w:after="120"/>
-      </w:pPr>
-      <w:r>
-        <w:rPr>
-          <w:i w:val="false"/>
-          <w:iCs w:val="false"/>
-        </w:rPr>
-        <w:t xml:space="preserve">Registo e consulta das paletes de produto acabado, que chegam do fecho da produção Honetop.</w:t>
-      </w:r>
-    </w:p>
-    <w:p>
-      <w:pPr>
-        <w:spacing w:after="120"/>
-      </w:pPr>
-      <w:r>
-        <w:rPr>
-          <w:i w:val="false"/>
-          <w:iCs w:val="false"/>
-          <w:color w:val="555555"/>
-        </w:rPr>
-        <w:t xml:space="preserve">Liga a: Honetop, Dashboard.</w:t>
+        <w:t xml:space="preserve">Tarefas</w:t>
+      </w:r>
+    </w:p>
+    <w:p>
+      <w:pPr>
+        <w:spacing w:after="120"/>
+      </w:pPr>
+      <w:r>
+        <w:rPr>
+          <w:i w:val="false"/>
+          <w:iCs w:val="false"/>
+        </w:rPr>
+        <w:t xml:space="preserve">Escala mensal de tarefas da equipa.</w:t>
+      </w:r>
+    </w:p>
+    <w:p>
+      <w:pPr>
+        <w:spacing w:after="120"/>
+      </w:pPr>
+      <w:r>
+        <w:rPr>
+          <w:i w:val="false"/>
+          <w:iCs w:val="false"/>
+          <w:color w:val="555555"/>
+        </w:rPr>
+        <w:t xml:space="preserve">Liga a: Escalas, Coordenador.</w:t>
       </w:r>
     </w:p>
     <w:p>
@@ -1307,19 +1281,32 @@
           <w:b/>
           <w:bCs/>
         </w:rPr>
-        <w:t xml:space="preserve">Suporte</w:t>
-      </w:r>
-    </w:p>
-    <w:p>
-      <w:pPr>
-        <w:spacing w:after="120"/>
-      </w:pPr>
-      <w:r>
-        <w:rPr>
-          <w:i w:val="false"/>
-          <w:iCs w:val="false"/>
-        </w:rPr>
-        <w:t xml:space="preserve">Área para pedir ajuda e reportar problemas.</w:t>
+        <w:t xml:space="preserve">Produtos Acabados</w:t>
+      </w:r>
+    </w:p>
+    <w:p>
+      <w:pPr>
+        <w:spacing w:after="120"/>
+      </w:pPr>
+      <w:r>
+        <w:rPr>
+          <w:i w:val="false"/>
+          <w:iCs w:val="false"/>
+        </w:rPr>
+        <w:t xml:space="preserve">Registo e consulta das paletes de produto acabado, que chegam do fecho da produção Honetop.</w:t>
+      </w:r>
+    </w:p>
+    <w:p>
+      <w:pPr>
+        <w:spacing w:after="120"/>
+      </w:pPr>
+      <w:r>
+        <w:rPr>
+          <w:i w:val="false"/>
+          <w:iCs w:val="false"/>
+          <w:color w:val="555555"/>
+        </w:rPr>
+        <w:t xml:space="preserve">Liga a: Honetop, Dashboard.</w:t>
       </w:r>
     </w:p>
     <w:p>
@@ -1332,6 +1319,31 @@
           <w:b/>
           <w:bCs/>
         </w:rPr>
+        <w:t xml:space="preserve">Suporte</w:t>
+      </w:r>
+    </w:p>
+    <w:p>
+      <w:pPr>
+        <w:spacing w:after="120"/>
+      </w:pPr>
+      <w:r>
+        <w:rPr>
+          <w:i w:val="false"/>
+          <w:iCs w:val="false"/>
+        </w:rPr>
+        <w:t xml:space="preserve">Área para pedir ajuda e reportar problemas.</w:t>
+      </w:r>
+    </w:p>
+    <w:p>
+      <w:pPr>
+        <w:pStyle w:val="Heading2"/>
+        <w:spacing w:after="100" w:before="240"/>
+      </w:pPr>
+      <w:r>
+        <w:rPr>
+          <w:b/>
+          <w:bCs/>
+        </w:rPr>
         <w:t xml:space="preserve">Configurações</w:t>
       </w:r>
     </w:p>
@@ -1344,7 +1356,46 @@
           <w:i w:val="false"/>
           <w:iCs w:val="false"/>
         </w:rPr>
-        <w:t xml:space="preserve">Configurações do sistema, disponíveis apenas para administradores.</w:t>
+        <w:t xml:space="preserve">Configurações do sistema, incluindo a aba Qualidade para o controlo de qualidade das salas.</w:t>
+      </w:r>
+    </w:p>
+    <w:p>
+      <w:pPr>
+        <w:pStyle w:val="ListParagraph"/>
+        <w:numPr>
+          <w:ilvl w:val="0"/>
+          <w:numId w:val="1"/>
+        </w:numPr>
+        <w:spacing w:after="60"/>
+      </w:pPr>
+      <w:r>
+        <w:t xml:space="preserve">Na aba Qualidade, escolha a sala (Honetop ou Barritas) e crie as perguntas do controlo de qualidade.</w:t>
+      </w:r>
+    </w:p>
+    <w:p>
+      <w:pPr>
+        <w:pStyle w:val="ListParagraph"/>
+        <w:numPr>
+          <w:ilvl w:val="0"/>
+          <w:numId w:val="1"/>
+        </w:numPr>
+        <w:spacing w:after="60"/>
+      </w:pPr>
+      <w:r>
+        <w:t xml:space="preserve">Defina se cada pergunta se aplica a todas as horas ou apenas a uma hora específica (ex.: teste organolético às 09:00).</w:t>
+      </w:r>
+    </w:p>
+    <w:p>
+      <w:pPr>
+        <w:pStyle w:val="ListParagraph"/>
+        <w:numPr>
+          <w:ilvl w:val="0"/>
+          <w:numId w:val="1"/>
+        </w:numPr>
+        <w:spacing w:after="60"/>
+      </w:pPr>
+      <w:r>
+        <w:t xml:space="preserve">As perguntas surgem no envelope da sala e as respostas ficam visíveis em Gestão › Qualidade.</w:t>
       </w:r>
     </w:p>
     <w:p>

</xml_diff>

<commit_message>
Editar produtos acabados na BOM com linhas, filtros e pesquisa
</commit_message>
<xml_diff>
--- a/public/docs/manual-manageop.docx
+++ b/public/docs/manual-manageop.docx
@@ -1294,6 +1294,30 @@
           <w:iCs w:val="false"/>
         </w:rPr>
         <w:t xml:space="preserve">Registo e consulta das paletes de produto acabado, que chegam do fecho da produção Honetop.</w:t>
+      </w:r>
+    </w:p>
+    <w:p>
+      <w:pPr>
+        <w:spacing w:after="120"/>
+      </w:pPr>
+      <w:r>
+        <w:rPr>
+          <w:i w:val="false"/>
+          <w:iCs w:val="false"/>
+        </w:rPr>
+        <w:t xml:space="preserve">No separador "Produto acabado" do BOM, as paletes surgem em linhas com pesquisa (produto, palete ou lote) e um filtro por Tudo, data de produção, lote ou data de registo.</w:t>
+      </w:r>
+    </w:p>
+    <w:p>
+      <w:pPr>
+        <w:spacing w:after="120"/>
+      </w:pPr>
+      <w:r>
+        <w:rPr>
+          <w:i w:val="false"/>
+          <w:iCs w:val="false"/>
+        </w:rPr>
+        <w:t xml:space="preserve">Cada linha tem um botão de edição (lápis) para corrigir os dados da palete — produto, palete, quantidade, lote, validade, data de produção e destino HQ/B2B.</w:t>
       </w:r>
     </w:p>
     <w:p>

</xml_diff>

<commit_message>
Adicionar edição/eliminação por linha na saída de produto acabado
</commit_message>
<xml_diff>
--- a/public/docs/manual-manageop.docx
+++ b/public/docs/manual-manageop.docx
@@ -1318,6 +1318,18 @@
           <w:iCs w:val="false"/>
         </w:rPr>
         <w:t xml:space="preserve">Cada linha tem um botão de edição (lápis) para corrigir os dados da palete — produto, palete, quantidade, lote, validade, data de produção e destino HQ/B2B.</w:t>
+      </w:r>
+    </w:p>
+    <w:p>
+      <w:pPr>
+        <w:spacing w:after="120"/>
+      </w:pPr>
+      <w:r>
+        <w:rPr>
+          <w:i w:val="false"/>
+          <w:iCs w:val="false"/>
+        </w:rPr>
+        <w:t xml:space="preserve">Na página de Saída de Produto Acabado, cada linha tem também botões para editar (enquanto não estiver expedida) e eliminar a palete, além de validar armazém e registar a expedição.</w:t>
       </w:r>
     </w:p>
     <w:p>

</xml_diff>

<commit_message>
Adiciona ordenação e resumo de armazém na saída de produto acabado
</commit_message>
<xml_diff>
--- a/public/docs/manual-manageop.docx
+++ b/public/docs/manual-manageop.docx
@@ -1330,6 +1330,18 @@
           <w:iCs w:val="false"/>
         </w:rPr>
         <w:t xml:space="preserve">Na página de Saída de Produto Acabado, cada linha tem também botões para editar (enquanto não estiver expedida) e eliminar a palete, além de validar armazém e registar a expedição.</w:t>
+      </w:r>
+    </w:p>
+    <w:p>
+      <w:pPr>
+        <w:spacing w:after="120"/>
+      </w:pPr>
+      <w:r>
+        <w:rPr>
+          <w:i w:val="false"/>
+          <w:iCs w:val="false"/>
+        </w:rPr>
+        <w:t xml:space="preserve">A página tem pesquisa e ordenação (por ordem de entrada, lote ou quantidade, crescente ou decrescente), e mostra no fundo um resumo do armazém: total de paletes, paletes por peso (500 g e 1 kg), total de sacos e sacos por peso.</w:t>
       </w:r>
     </w:p>
     <w:p>

</xml_diff>

<commit_message>
feat: ordenação por nº de palete, bloqueio de duplicados e destino HQ/B2B na entrada manual de produto acabado
</commit_message>
<xml_diff>
--- a/public/docs/manual-manageop.docx
+++ b/public/docs/manual-manageop.docx
@@ -1329,19 +1329,31 @@
           <w:i w:val="false"/>
           <w:iCs w:val="false"/>
         </w:rPr>
-        <w:t xml:space="preserve">Na página de Saída de Produto Acabado, cada linha tem também botões para editar (enquanto não estiver expedida) e eliminar a palete, além de validar armazém e registar a expedição.</w:t>
-      </w:r>
-    </w:p>
-    <w:p>
-      <w:pPr>
-        <w:spacing w:after="120"/>
-      </w:pPr>
-      <w:r>
-        <w:rPr>
-          <w:i w:val="false"/>
-          <w:iCs w:val="false"/>
-        </w:rPr>
-        <w:t xml:space="preserve">A página tem pesquisa e ordenação (por ordem de entrada, lote ou quantidade, crescente ou decrescente), e mostra no fundo um resumo do armazém: total de paletes, paletes por peso (500 g e 1 kg), total de sacos e sacos por peso.</w:t>
+        <w:t xml:space="preserve">Na página de Saída de Produto Acabado, ao dar entrada manual de uma palete escolhe também o destino (HQ ou B2B). Se o número da palete já existir no sistema (mesmo já expedida), a aplicação bloqueia a criação e mostra um alerta com a opção de editar o registo existente.</w:t>
+      </w:r>
+    </w:p>
+    <w:p>
+      <w:pPr>
+        <w:spacing w:after="120"/>
+      </w:pPr>
+      <w:r>
+        <w:rPr>
+          <w:i w:val="false"/>
+          <w:iCs w:val="false"/>
+        </w:rPr>
+        <w:t xml:space="preserve">Cada linha tem também botões para editar (enquanto não estiver expedida) e eliminar a palete, além de validar armazém e registar a expedição.</w:t>
+      </w:r>
+    </w:p>
+    <w:p>
+      <w:pPr>
+        <w:spacing w:after="120"/>
+      </w:pPr>
+      <w:r>
+        <w:rPr>
+          <w:i w:val="false"/>
+          <w:iCs w:val="false"/>
+        </w:rPr>
+        <w:t xml:space="preserve">A página tem pesquisa e ordenação (por ordem de entrada, nº da palete, lote ou quantidade, crescente ou decrescente), e mostra no fundo um resumo do armazém: total de paletes, paletes por peso (500 g e 1 kg), total de sacos e sacos por peso.</w:t>
       </w:r>
     </w:p>
     <w:p>

</xml_diff>